<commit_message>
add more information about me
</commit_message>
<xml_diff>
--- a/Charbel_Mdawar_Software_Engineer.docx
+++ b/Charbel_Mdawar_Software_Engineer.docx
@@ -47,8 +47,19 @@
           <w:color w:val="555555"/>
           <w:sz w:val="18"/>
         </w:rPr>
-        <w:t>Damascus, Syria | +963 998 173 418 | charbel.mdawar45@gmail.com</w:t>
+        <w:t xml:space="preserve">Damascus, Syria | +963 932 489 122 | charbel.mdawar45@gmail.com | </w:t>
       </w:r>
+      <w:hyperlink r:id="rId9">
+        <w:r>
+          <w:rPr>
+            <w:rFonts w:ascii="Arial" w:hAnsi="Arial"/>
+            <w:sz w:val="18"/>
+            <w:color w:val="1F4E79"/>
+            <w:u w:val="single"/>
+          </w:rPr>
+          <w:t>LinkedIn</w:t>
+        </w:r>
+      </w:hyperlink>
     </w:p>
     <w:p>
       <w:pPr>
@@ -375,6 +386,157 @@
           <w:sz w:val="18"/>
         </w:rPr>
         <w:t>Validate reliability and performance under load using API and performance-testing tools, then communicate risks and release readiness to stakeholders.</w:t>
+      </w:r>
+    </w:p>
+    <w:p>
+      <w:pPr>
+        <w:keepNext/>
+        <w:spacing w:before="40" w:after="10"/>
+      </w:pPr>
+      <w:r>
+        <w:rPr>
+          <w:rFonts w:ascii="Arial" w:hAnsi="Arial"/>
+          <w:b/>
+          <w:i w:val="0"/>
+          <w:color w:val="1F4E79"/>
+          <w:sz w:val="19"/>
+        </w:rPr>
+        <w:t>Selected QA Projects</w:t>
+      </w:r>
+    </w:p>
+    <w:p>
+      <w:pPr>
+        <w:pStyle w:val="ListBullet"/>
+        <w:keepLines/>
+      </w:pPr>
+      <w:hyperlink r:id="rId10">
+        <w:r>
+          <w:rPr>
+            <w:rFonts w:ascii="Arial" w:hAnsi="Arial"/>
+            <w:sz w:val="18"/>
+            <w:color w:val="1F4E79"/>
+            <w:u w:val="single"/>
+          </w:rPr>
+          <w:t>Al-Ahlam ERP &amp; Manufacturing System</w:t>
+        </w:r>
+      </w:hyperlink>
+      <w:r>
+        <w:rPr>
+          <w:rFonts w:ascii="Arial" w:hAnsi="Arial"/>
+          <w:b w:val="0"/>
+          <w:i w:val="0"/>
+          <w:color w:val="1F1F1F"/>
+          <w:sz w:val="18"/>
+        </w:rPr>
+        <w:t>: Led end-to-end validation of ERP and manufacturing workflows, focusing on business-rule coverage and data integrity to reduce operational risk for a large food producer.</w:t>
+      </w:r>
+    </w:p>
+    <w:p>
+      <w:pPr>
+        <w:pStyle w:val="ListBullet"/>
+        <w:keepLines/>
+      </w:pPr>
+      <w:hyperlink r:id="rId11">
+        <w:r>
+          <w:rPr>
+            <w:rFonts w:ascii="Arial" w:hAnsi="Arial"/>
+            <w:sz w:val="18"/>
+            <w:color w:val="1F4E79"/>
+            <w:u w:val="single"/>
+          </w:rPr>
+          <w:t>Salaza ERP, CRM &amp; HR</w:t>
+        </w:r>
+      </w:hyperlink>
+      <w:r>
+        <w:rPr>
+          <w:rFonts w:ascii="Arial" w:hAnsi="Arial"/>
+          <w:b w:val="0"/>
+          <w:i w:val="0"/>
+          <w:color w:val="1F1F1F"/>
+          <w:sz w:val="18"/>
+        </w:rPr>
+        <w:t>: Validated multi-branch business, customer, and workforce workflows supporting 16 salons across Syria, the UAE, and Iraq, improving release confidence across branch operations.</w:t>
+      </w:r>
+    </w:p>
+    <w:p>
+      <w:pPr>
+        <w:pStyle w:val="ListBullet"/>
+        <w:keepLines/>
+      </w:pPr>
+      <w:hyperlink r:id="rId12">
+        <w:r>
+          <w:rPr>
+            <w:rFonts w:ascii="Arial" w:hAnsi="Arial"/>
+            <w:sz w:val="18"/>
+            <w:color w:val="1F4E79"/>
+            <w:u w:val="single"/>
+          </w:rPr>
+          <w:t>El-Salleh E-Commerce</w:t>
+        </w:r>
+      </w:hyperlink>
+      <w:r>
+        <w:rPr>
+          <w:rFonts w:ascii="Arial" w:hAnsi="Arial"/>
+          <w:b w:val="0"/>
+          <w:i w:val="0"/>
+          <w:color w:val="1F1F1F"/>
+          <w:sz w:val="18"/>
+        </w:rPr>
+        <w:t>: Tested catalog, cart, ordering, store-coverage, and delivery journeys to protect order accuracy and provide a more reliable grocery-shopping experience.</w:t>
+      </w:r>
+    </w:p>
+    <w:p>
+      <w:pPr>
+        <w:pStyle w:val="ListBullet"/>
+        <w:keepLines/>
+      </w:pPr>
+      <w:hyperlink r:id="rId13">
+        <w:r>
+          <w:rPr>
+            <w:rFonts w:ascii="Arial" w:hAnsi="Arial"/>
+            <w:sz w:val="18"/>
+            <w:color w:val="1F4E79"/>
+            <w:u w:val="single"/>
+          </w:rPr>
+          <w:t>GoPal</w:t>
+        </w:r>
+      </w:hyperlink>
+      <w:r>
+        <w:rPr>
+          <w:rFonts w:ascii="Arial" w:hAnsi="Arial"/>
+          <w:b w:val="0"/>
+          <w:i w:val="0"/>
+          <w:color w:val="1F1F1F"/>
+          <w:sz w:val="18"/>
+        </w:rPr>
+        <w:t>: Validated child profiles, activity discovery, booking, provider workflows, assessment outputs, and loyalty integration to strengthen reliability for families and activity centers.</w:t>
+      </w:r>
+    </w:p>
+    <w:p>
+      <w:pPr>
+        <w:pStyle w:val="ListBullet"/>
+        <w:keepLines/>
+      </w:pPr>
+      <w:hyperlink r:id="rId14">
+        <w:r>
+          <w:rPr>
+            <w:rFonts w:ascii="Arial" w:hAnsi="Arial"/>
+            <w:sz w:val="18"/>
+            <w:color w:val="1F4E79"/>
+            <w:u w:val="single"/>
+          </w:rPr>
+          <w:t>Smo Al Mosafer</w:t>
+        </w:r>
+      </w:hyperlink>
+      <w:r>
+        <w:rPr>
+          <w:rFonts w:ascii="Arial" w:hAnsi="Arial"/>
+          <w:b w:val="0"/>
+          <w:i w:val="0"/>
+          <w:color w:val="1F1F1F"/>
+          <w:sz w:val="18"/>
+        </w:rPr>
+        <w:t>: Tested transport booking and service-request journeys across customer and operational workflows, reducing release risk in trip creation and customer-facing features.</w:t>
       </w:r>
     </w:p>
     <w:p>

</xml_diff>